<commit_message>
EV01: agrega starter guiado por pruebas
Incluye Maven Wrapper, TODOs numerados, pruebas públicas progresivas y bitácora de IA. Actualiza el examen para distinguir pruebas entregadas y propias, y retira del repositorio los documentos reservados para evaluadores.
</commit_message>
<xml_diff>
--- a/evaluaciones/evaluacion-01/01_Prueba_Practica_Java_Fundamentos_Estudiantes.docx
+++ b/evaluaciones/evaluacion-01/01_Prueba_Practica_Java_Fundamentos_Estudiantes.docx
@@ -1044,6 +1044,26 @@
           <w:color w:val="1F1F1F"/>
           <w:sz w:val="21"/>
         </w:rPr>
+        <w:t>Trabaje dentro de evaluaciones/evaluacion-01/ejercicios; ese starter contiene el contrato y las pruebas públicas.</w:t>
+      </w:r>
+    </w:p>
+    <w:p>
+      <w:pPr>
+        <w:keepLines w:val="0"/>
+        <w:numPr>
+          <w:ilvl w:val="0"/>
+          <w:numId w:val="11"/>
+        </w:numPr>
+        <w:spacing w:before="0" w:after="60" w:line="259" w:lineRule="auto"/>
+      </w:pPr>
+      <w:r>
+        <w:rPr>
+          <w:rFonts w:ascii="Arial" w:hAnsi="Arial"/>
+          <w:b w:val="0"/>
+          <w:i w:val="0"/>
+          <w:color w:val="1F1F1F"/>
+          <w:sz w:val="21"/>
+        </w:rPr>
         <w:t>pom.xml y Maven Wrapper operativo (puede reutilizar el starter entregado).</w:t>
       </w:r>
     </w:p>
@@ -1164,7 +1184,27 @@
           <w:color w:val="1F1F1F"/>
           <w:sz w:val="21"/>
         </w:rPr>
-        <w:t>src/test/java/com/sigeo/evaluacion01/GestorSolicitudesTest.java</w:t>
+        <w:t>src/test/java/com/sigeo/evaluacion01/GestorSolicitudesTest.java (pruebas públicas; no modificar).</w:t>
+      </w:r>
+    </w:p>
+    <w:p>
+      <w:pPr>
+        <w:keepLines w:val="0"/>
+        <w:numPr>
+          <w:ilvl w:val="0"/>
+          <w:numId w:val="11"/>
+        </w:numPr>
+        <w:spacing w:before="0" w:after="60" w:line="259" w:lineRule="auto"/>
+      </w:pPr>
+      <w:r>
+        <w:rPr>
+          <w:rFonts w:ascii="Arial" w:hAnsi="Arial"/>
+          <w:b w:val="0"/>
+          <w:i w:val="0"/>
+          <w:color w:val="1F1F1F"/>
+          <w:sz w:val="21"/>
+        </w:rPr>
+        <w:t>src/test/java/com/sigeo/evaluacion01/PruebasPropiasTest.java (crear con sus casos adicionales).</w:t>
       </w:r>
     </w:p>
     <w:p>
@@ -2638,7 +2678,24 @@
           <w:color w:val="1F1F1F"/>
           <w:sz w:val="21"/>
         </w:rPr>
-        <w:t>Implemente al menos siete pruebas JUnit 5 con nombres descriptivos:</w:t>
+        <w:t>El starter incluye pruebas públicas que expresan el contrato. No las modifique: implemente el código de producción hasta hacerlas pasar. Luego agregue al menos dos pruebas propias en PruebasPropiasTest.java.</w:t>
+      </w:r>
+    </w:p>
+    <w:p>
+      <w:pPr>
+        <w:keepLines w:val="0"/>
+        <w:spacing w:before="0" w:after="100" w:line="259" w:lineRule="auto"/>
+        <w:jc w:val="left"/>
+      </w:pPr>
+      <w:r>
+        <w:rPr>
+          <w:rFonts w:ascii="Arial" w:hAnsi="Arial"/>
+          <w:b/>
+          <w:i w:val="0"/>
+          <w:color w:val="1F1F1F"/>
+          <w:sz w:val="18"/>
+        </w:rPr>
+        <w:t>Distribución: 14 puntos por hacer pasar las pruebas públicas sin alterarlas y 6 puntos por dos pruebas propias relevantes, legibles y ejecutables.</w:t>
       </w:r>
     </w:p>
     <w:p>
@@ -2658,7 +2715,7 @@
           <w:color w:val="1F1F1F"/>
           <w:sz w:val="21"/>
         </w:rPr>
-        <w:t>crea una solicitud válida;</w:t>
+        <w:t>Las pruebas públicas cubren creación, invariantes, registro, búsqueda, duplicados, filtrado, conteo y exportación con @TempDir.</w:t>
       </w:r>
     </w:p>
     <w:p>
@@ -2678,7 +2735,7 @@
           <w:color w:val="1F1F1F"/>
           <w:sz w:val="21"/>
         </w:rPr>
-        <w:t>rechaza id vacío o descripción vacía;</w:t>
+        <w:t>Sus dos pruebas deben cubrir límites o errores adicionales y usar nombres que expliquen el comportamiento esperado.</w:t>
       </w:r>
     </w:p>
     <w:p>
@@ -2698,87 +2755,7 @@
           <w:color w:val="1F1F1F"/>
           <w:sz w:val="21"/>
         </w:rPr>
-        <w:t>registra y busca por id;</w:t>
-      </w:r>
-    </w:p>
-    <w:p>
-      <w:pPr>
-        <w:keepLines w:val="0"/>
-        <w:numPr>
-          <w:ilvl w:val="0"/>
-          <w:numId w:val="11"/>
-        </w:numPr>
-        <w:spacing w:before="0" w:after="60" w:line="259" w:lineRule="auto"/>
-      </w:pPr>
-      <w:r>
-        <w:rPr>
-          <w:rFonts w:ascii="Arial" w:hAnsi="Arial"/>
-          <w:b w:val="0"/>
-          <w:i w:val="0"/>
-          <w:color w:val="1F1F1F"/>
-          <w:sz w:val="21"/>
-        </w:rPr>
-        <w:t>rechaza un id duplicado;</w:t>
-      </w:r>
-    </w:p>
-    <w:p>
-      <w:pPr>
-        <w:keepLines w:val="0"/>
-        <w:numPr>
-          <w:ilvl w:val="0"/>
-          <w:numId w:val="11"/>
-        </w:numPr>
-        <w:spacing w:before="0" w:after="60" w:line="259" w:lineRule="auto"/>
-      </w:pPr>
-      <w:r>
-        <w:rPr>
-          <w:rFonts w:ascii="Arial" w:hAnsi="Arial"/>
-          <w:b w:val="0"/>
-          <w:i w:val="0"/>
-          <w:color w:val="1F1F1F"/>
-          <w:sz w:val="21"/>
-        </w:rPr>
-        <w:t>filtra por prioridad sin mezclar resultados;</w:t>
-      </w:r>
-    </w:p>
-    <w:p>
-      <w:pPr>
-        <w:keepLines w:val="0"/>
-        <w:numPr>
-          <w:ilvl w:val="0"/>
-          <w:numId w:val="11"/>
-        </w:numPr>
-        <w:spacing w:before="0" w:after="60" w:line="259" w:lineRule="auto"/>
-      </w:pPr>
-      <w:r>
-        <w:rPr>
-          <w:rFonts w:ascii="Arial" w:hAnsi="Arial"/>
-          <w:b w:val="0"/>
-          <w:i w:val="0"/>
-          <w:color w:val="1F1F1F"/>
-          <w:sz w:val="21"/>
-        </w:rPr>
-        <w:t>cuenta solicitudes por prioridad;</w:t>
-      </w:r>
-    </w:p>
-    <w:p>
-      <w:pPr>
-        <w:keepLines w:val="0"/>
-        <w:numPr>
-          <w:ilvl w:val="0"/>
-          <w:numId w:val="11"/>
-        </w:numPr>
-        <w:spacing w:before="0" w:after="60" w:line="259" w:lineRule="auto"/>
-      </w:pPr>
-      <w:r>
-        <w:rPr>
-          <w:rFonts w:ascii="Arial" w:hAnsi="Arial"/>
-          <w:b w:val="0"/>
-          <w:i w:val="0"/>
-          <w:color w:val="1F1F1F"/>
-          <w:sz w:val="21"/>
-        </w:rPr>
-        <w:t>exporta y permite leer el archivo generado en @TempDir.</w:t>
+        <w:t>Todas las pruebas deben ejecutarse con ./mvnw -q test y quedar en verde.</w:t>
       </w:r>
     </w:p>
     <w:p>
@@ -3710,7 +3687,7 @@
                 <w:color w:val="1F1F1F"/>
                 <w:sz w:val="16"/>
               </w:rPr>
-              <w:t>Implementa únicamente registrar y su prueba de duplicado. Ejecuta ./mvnw -q test y detente. Muéstrame el diff y explica las decisiones.</w:t>
+              <w:t>Implementa únicamente registrar para hacer pasar la prueba pública de duplicado. Ejecuta ese test y detente. Muéstrame el diff y explica las decisiones.</w:t>
             </w:r>
           </w:p>
         </w:tc>
@@ -4307,7 +4284,7 @@
                 <w:color w:val="1F1F1F"/>
                 <w:sz w:val="17"/>
               </w:rPr>
-              <w:t>Pruebas y corrección de fallos.</w:t>
+              <w:t>Hacer pasar pruebas públicas y agregar dos pruebas propias.</w:t>
             </w:r>
           </w:p>
         </w:tc>
@@ -4513,7 +4490,7 @@
           <w:color w:val="1F1F1F"/>
           <w:sz w:val="21"/>
         </w:rPr>
-        <w:t>[ ] No modifiqué pruebas entregadas ni agregué dependencias.</w:t>
+        <w:t>[ ] No modifiqué pruebas entregadas; agregué dos pruebas propias y no incorporé dependencias.</w:t>
       </w:r>
     </w:p>
     <w:p>

</xml_diff>